<commit_message>
Build complete Word course package
</commit_message>
<xml_diff>
--- a/arbeitsblaetter/A10_Kopf_Fusszeile_Seitenzahlen.docx
+++ b/arbeitsblaetter/A10_Kopf_Fusszeile_Seitenzahlen.docx
@@ -176,7 +176,7 @@
                 <w:color w:val="FFFFFF"/>
                 <w:sz w:val="16"/>
               </w:rPr>
-              <w:t>SEITEN 2–3</w:t>
+              <w:t>ÜBUNGSSEITEN</w:t>
             </w:r>
           </w:p>
         </w:tc>
@@ -216,7 +216,7 @@
                 <w:color w:val="172A3A"/>
                 <w:sz w:val="19"/>
               </w:rPr>
-              <w:t>Arbeite nur auf den Seiten 2 und 3. Der normale Text ist bereits fertig.</w:t>
+              <w:t>Arbeite nur im Reisebericht auf den beiden folgenden Übungsseiten. Der normale Text ist bereits fertig.</w:t>
             </w:r>
           </w:p>
           <w:p>
@@ -279,7 +279,7 @@
                 <w:color w:val="17324D"/>
                 <w:sz w:val="18"/>
               </w:rPr>
-              <w:t>Doppelklicke ganz oben auf Seite 2</w:t>
+              <w:t>Doppelklicke ganz oben auf der ersten Übungsseite</w:t>
             </w:r>
             <w:r>
               <w:rPr>
@@ -347,7 +347,7 @@
                 <w:color w:val="17324D"/>
                 <w:sz w:val="18"/>
               </w:rPr>
-              <w:t>Doppelklicke ganz unten auf Seite 2</w:t>
+              <w:t>Doppelklicke ganz unten auf der ersten Übungsseite</w:t>
             </w:r>
             <w:r>
               <w:rPr>
@@ -425,7 +425,7 @@
                 <w:color w:val="172A3A"/>
                 <w:sz w:val="18"/>
               </w:rPr>
-              <w:t xml:space="preserve">  →  automatische Seitenzahl einfügen</w:t>
+              <w:t xml:space="preserve">  →  Einfügen → Seitenzahl → Aktuelle Position</w:t>
             </w:r>
           </w:p>
           <w:p>
@@ -449,7 +449,7 @@
                 <w:color w:val="17324D"/>
                 <w:sz w:val="18"/>
               </w:rPr>
-              <w:t>Kontrolliere Seite 3</w:t>
+              <w:t>Kontrolliere die zweite Übungsseite</w:t>
             </w:r>
             <w:r>
               <w:rPr>
@@ -459,7 +459,7 @@
                 <w:color w:val="172A3A"/>
                 <w:sz w:val="18"/>
               </w:rPr>
-              <w:t xml:space="preserve">  →  Kopf- und Fusszeile erscheinen dort automatisch.</w:t>
+              <w:t xml:space="preserve">  →  Kopf- und Fusszeile erscheinen dort automatisch; die Zahl steigt von 1 auf 2.</w:t>
             </w:r>
           </w:p>
         </w:tc>
@@ -526,7 +526,7 @@
                 <w:color w:val="172A3A"/>
                 <w:sz w:val="19"/>
               </w:rPr>
-              <w:t>Kopf- und Fusszeile sind eigene Seitenbereiche. Tippe diese Angaben nicht in den normalen Text.</w:t>
+              <w:t>Kopfzeile = Bereich oben. Fusszeile = Bereich unten. Beide wiederholen sich auf den Übungsseiten.</w:t>
             </w:r>
           </w:p>
         </w:tc>
@@ -593,7 +593,7 @@
                 <w:color w:val="172A3A"/>
                 <w:sz w:val="19"/>
               </w:rPr>
-              <w:t>Für die Zahl: Einfügen → Seitenzahl → Aktuelle Position. Die Nummer muss automatisch sein – nicht von Hand tippen.</w:t>
+              <w:t>Die Seitenzahl ist automatisch: Tippe nur «Seite » und füge die Zahl über Einfügen → Seitenzahl → Aktuelle Position ein. Die Zahl nicht von Hand schreiben.</w:t>
             </w:r>
           </w:p>
         </w:tc>
@@ -660,7 +660,7 @@
                 <w:color w:val="172A3A"/>
                 <w:sz w:val="18"/>
               </w:rPr>
-              <w:t>Oben steht auf beiden Übungsseiten «SCHULAUSFLUG LUZERN». Unten steht «Seite 1» bzw. «Seite 2».</w:t>
+              <w:t>Oben steht auf beiden Übungsseiten «SCHULAUSFLUG LUZERN». Unten steht auf der ersten Übungsseite «Seite 1» und auf der zweiten «Seite 2».</w:t>
             </w:r>
           </w:p>
         </w:tc>

</xml_diff>